<commit_message>
feat(demo): P23-T10 bank-grade retail account letter rewrite
Account opening and balance templates with fee and transaction tables, GLOBAL_ONLY footers, and rich structured bindings; Wave 2 demo rewrites complete.

Co-authored-by: Cursor <cursoragent@cursor.com>
</commit_message>
<xml_diff>
--- a/deploy/demo-retail-account/assets/retail-account-balance-master.docx
+++ b/deploy/demo-retail-account/assets/retail-account-balance-master.docx
@@ -9,43 +9,190 @@
       <w:r>
         <w:rPr>
           <w:b w:val="on"/>
-          <w:sz w:val="32"/>
+          <w:sz w:val="28"/>
           <w:color w:val="006633"/>
         </w:rPr>
-        <w:t>Meridian Retail Banking</w:t>
-      </w:r>
-    </w:p>
-    <w:p>
-      <w:pPr>
-        <w:jc w:val="center"/>
-      </w:pPr>
-      <w:r>
-        <w:rPr>
-          <w:b w:val="on"/>
-          <w:sz w:val="24"/>
-          <w:color w:val="000000"/>
-        </w:rPr>
         <w:t>Account Balance Confirmation</w:t>
       </w:r>
     </w:p>
-    <w:p/>
-    <w:p>
-      <w:r>
-        <w:t>{{anchor:RETAIL_BALANCE_BODY}}</w:t>
-      </w:r>
-    </w:p>
-    <w:p/>
-    <w:p>
-      <w:r>
-        <w:t>{{anchor:RETAIL_BALANCE_SUMMARY}}</w:t>
-      </w:r>
-    </w:p>
-    <w:p/>
+    <w:p>
+      <w:r>
+        <w:t>{{anchor:RAB_PARTIES}}</w:t>
+      </w:r>
+    </w:p>
+    <w:p>
+      <w:pPr>
+        <w:sectPr>
+          <w:type w:val="nextPage"/>
+        </w:sectPr>
+      </w:pPr>
+    </w:p>
+    <w:p>
+      <w:pPr>
+        <w:jc w:val="left"/>
+      </w:pPr>
+      <w:r>
+        <w:rPr>
+          <w:b w:val="on"/>
+          <w:sz w:val="24"/>
+        </w:rPr>
+        <w:t>Balance Confirmation</w:t>
+      </w:r>
+    </w:p>
+    <w:p>
+      <w:r>
+        <w:t>{{anchor:RAB_BALANCE_CONFIRMATION}}</w:t>
+      </w:r>
+    </w:p>
+    <w:p>
+      <w:pPr>
+        <w:sectPr>
+          <w:type w:val="nextPage"/>
+        </w:sectPr>
+      </w:pPr>
+    </w:p>
+    <w:p>
+      <w:pPr>
+        <w:jc w:val="left"/>
+      </w:pPr>
+      <w:r>
+        <w:rPr>
+          <w:b w:val="on"/>
+          <w:sz w:val="24"/>
+        </w:rPr>
+        <w:t>Transaction Summary</w:t>
+      </w:r>
+    </w:p>
+    <w:p>
+      <w:r>
+        <w:t>{{anchor:RAB_TRANSACTION_SUMMARY}}</w:t>
+      </w:r>
+    </w:p>
+    <w:p>
+      <w:pPr>
+        <w:sectPr>
+          <w:type w:val="nextPage"/>
+        </w:sectPr>
+      </w:pPr>
+    </w:p>
+    <w:p>
+      <w:pPr>
+        <w:jc w:val="left"/>
+      </w:pPr>
+      <w:r>
+        <w:rPr>
+          <w:b w:val="on"/>
+          <w:sz w:val="24"/>
+        </w:rPr>
+        <w:t>Interest and Tax</w:t>
+      </w:r>
+    </w:p>
+    <w:p>
+      <w:r>
+        <w:t>{{anchor:RAB_INTEREST_TAX}}</w:t>
+      </w:r>
+    </w:p>
+    <w:p>
+      <w:pPr>
+        <w:sectPr>
+          <w:type w:val="nextPage"/>
+        </w:sectPr>
+      </w:pPr>
+    </w:p>
+    <w:p>
+      <w:pPr>
+        <w:jc w:val="left"/>
+      </w:pPr>
+      <w:r>
+        <w:rPr>
+          <w:b w:val="on"/>
+          <w:sz w:val="24"/>
+        </w:rPr>
+        <w:t>Applicable Fees</w:t>
+      </w:r>
+    </w:p>
+    <w:p>
+      <w:r>
+        <w:t>{{anchor:RAB_FEE_SCHEDULE}}</w:t>
+      </w:r>
+    </w:p>
+    <w:p>
+      <w:pPr>
+        <w:sectPr>
+          <w:type w:val="nextPage"/>
+        </w:sectPr>
+      </w:pPr>
+    </w:p>
+    <w:p>
+      <w:pPr>
+        <w:jc w:val="left"/>
+      </w:pPr>
+      <w:r>
+        <w:rPr>
+          <w:b w:val="on"/>
+          <w:sz w:val="24"/>
+        </w:rPr>
+        <w:t>Regulatory Notice</w:t>
+      </w:r>
+    </w:p>
+    <w:p>
+      <w:r>
+        <w:t>{{anchor:RAB_REGULATORY}}</w:t>
+      </w:r>
+    </w:p>
+    <w:p>
+      <w:pPr>
+        <w:sectPr>
+          <w:type w:val="nextPage"/>
+        </w:sectPr>
+      </w:pPr>
+    </w:p>
+    <w:p>
+      <w:pPr>
+        <w:jc w:val="left"/>
+      </w:pPr>
+      <w:r>
+        <w:rPr>
+          <w:b w:val="on"/>
+          <w:sz w:val="24"/>
+        </w:rPr>
+        <w:t>Authorised Signatory</w:t>
+      </w:r>
+    </w:p>
+    <w:p>
+      <w:r>
+        <w:t>{{anchor:RAB_SIGNATURE}}</w:t>
+      </w:r>
+    </w:p>
+    <w:p>
+      <w:pPr>
+        <w:sectPr>
+          <w:type w:val="nextPage"/>
+        </w:sectPr>
+      </w:pPr>
+    </w:p>
+    <w:p>
+      <w:pPr>
+        <w:jc w:val="left"/>
+      </w:pPr>
+      <w:r>
+        <w:rPr>
+          <w:b w:val="on"/>
+          <w:sz w:val="24"/>
+        </w:rPr>
+        <w:t>Important Information</w:t>
+      </w:r>
+    </w:p>
+    <w:p>
+      <w:r>
+        <w:t>{{anchor:RAB_DISCLAIMER}}</w:t>
+      </w:r>
+    </w:p>
     <w:sectPr>
-      <main:headerReference xmlns:main="http://schemas.openxmlformats.org/wordprocessingml/2006/main" xmlns:rel="http://schemas.openxmlformats.org/officeDocument/2006/relationships" main:type="default" rel:id="rId2"/>
-      <main:footerReference xmlns:main="http://schemas.openxmlformats.org/wordprocessingml/2006/main" xmlns:rel="http://schemas.openxmlformats.org/officeDocument/2006/relationships" main:type="default" rel:id="rId3"/>
+      <main:headerReference xmlns:main="http://schemas.openxmlformats.org/wordprocessingml/2006/main" xmlns:rel="http://schemas.openxmlformats.org/officeDocument/2006/relationships" main:type="default" rel:id="rId3"/>
+      <main:footerReference xmlns:main="http://schemas.openxmlformats.org/wordprocessingml/2006/main" xmlns:rel="http://schemas.openxmlformats.org/officeDocument/2006/relationships" main:type="default" rel:id="rId4"/>
       <main:pgSz xmlns:main="http://schemas.openxmlformats.org/wordprocessingml/2006/main" main:w="11906" main:h="16838"/>
-      <main:pgMar xmlns:main="http://schemas.openxmlformats.org/wordprocessingml/2006/main" main:top="1440" main:bottom="1440" main:left="1701" main:right="1276" main:header="708" main:footer="708" main:gutter="0"/>
+      <main:pgMar xmlns:main="http://schemas.openxmlformats.org/wordprocessingml/2006/main" main:top="1440" main:bottom="1440" main:left="1440" main:right="1440" main:header="708" main:footer="708" main:gutter="0"/>
     </w:sectPr>
   </w:body>
 </w:document>
@@ -62,7 +209,7 @@
         <w:sz w:val="14"/>
         <w:color w:val="666666"/>
       </w:rPr>
-      <w:t>Customer Service: 0800 123 4567  |  42 High Street, Manchester M1 1AA</w:t>
+      <w:t>Customer Service: 0800 123 4567  |  42 High Street, Manchester M1 1AA  |  FSCS protected deposits</w:t>
     </w:r>
   </w:p>
   <w:p>
@@ -112,18 +259,6 @@
     </w:r>
     <w:r>
       <w:fldChar w:fldCharType="end"/>
-    </w:r>
-  </w:p>
-  <w:p>
-    <w:pPr>
-      <w:jc w:val="center"/>
-    </w:pPr>
-    <w:r>
-      <w:rPr>
-        <w:sz w:val="14"/>
-        <w:i w:val="on"/>
-      </w:rPr>
-      <w:t>This is a demonstration document — not a contractual offer</w:t>
     </w:r>
   </w:p>
 </w:ftr>
@@ -132,6 +267,9 @@
 <file path=word/header1.xml><?xml version="1.0" encoding="utf-8"?>
 <w:hdr xmlns:w="http://schemas.openxmlformats.org/wordprocessingml/2006/main">
   <w:p>
+    <w:pPr>
+      <w:jc w:val="left"/>
+    </w:pPr>
     <w:r>
       <w:rPr>
         <w:b w:val="on"/>
@@ -153,7 +291,7 @@
         <w:sz w:val="22"/>
         <w:szCs w:val="22"/>
         <w:color w:val="000000"/>
-        <w:lang w:val="en-US"/>
+        <w:lang w:val="en-US" w:bidi="en-US"/>
       </w:rPr>
     </w:rPrDefault>
     <w:pPrDefault>
@@ -171,5 +309,83 @@
       <w:lang w:val="en-US"/>
     </w:rPr>
   </w:style>
+  <w:style w:type="paragraph" w:styleId="Heading1">
+    <w:name w:val="Heading1"/>
+    <w:qFormat/>
+    <w:rPr>
+      <w:sz w:val="32"/>
+      <w:rFonts w:ascii="Cambria" w:hAnsi="Cambria" w:cs="Cambria"/>
+      <w:b/>
+    </w:rPr>
+  </w:style>
+  <w:style w:type="paragraph" w:styleId="Heading2">
+    <w:name w:val="Heading2"/>
+    <w:qFormat/>
+    <w:rPr>
+      <w:sz w:val="28"/>
+      <w:rFonts w:ascii="Cambria" w:hAnsi="Cambria" w:cs="Cambria"/>
+      <w:b/>
+    </w:rPr>
+  </w:style>
+  <w:style w:type="paragraph" w:styleId="Heading3">
+    <w:name w:val="Heading3"/>
+    <w:qFormat/>
+    <w:rPr>
+      <w:sz w:val="24"/>
+      <w:rFonts w:ascii="Cambria" w:hAnsi="Cambria" w:cs="Cambria"/>
+      <w:b/>
+    </w:rPr>
+  </w:style>
+  <w:style w:type="paragraph" w:styleId="ClauseBody">
+    <w:name w:val="ClauseBody"/>
+    <w:qFormat/>
+    <w:rPr>
+      <w:sz w:val="20"/>
+      <w:rFonts w:ascii="Calibri" w:hAnsi="Calibri" w:cs="Calibri"/>
+    </w:rPr>
+  </w:style>
+  <w:style w:type="paragraph" w:styleId="DefinedTerm">
+    <w:name w:val="DefinedTerm"/>
+    <w:qFormat/>
+    <w:rPr>
+      <w:sz w:val="20"/>
+      <w:rFonts w:ascii="Calibri" w:hAnsi="Calibri" w:cs="Calibri"/>
+      <w:b/>
+    </w:rPr>
+  </w:style>
+  <w:style w:type="paragraph" w:styleId="TableHeader">
+    <w:name w:val="TableHeader"/>
+    <w:qFormat/>
+    <w:rPr>
+      <w:sz w:val="20"/>
+      <w:rFonts w:ascii="Calibri" w:hAnsi="Calibri" w:cs="Calibri"/>
+      <w:b/>
+    </w:rPr>
+  </w:style>
+  <w:style w:type="paragraph" w:styleId="ScheduleTitle">
+    <w:name w:val="ScheduleTitle"/>
+    <w:qFormat/>
+    <w:rPr>
+      <w:sz w:val="26"/>
+      <w:rFonts w:ascii="Cambria" w:hAnsi="Cambria" w:cs="Cambria"/>
+      <w:b/>
+    </w:rPr>
+  </w:style>
+  <w:style w:type="paragraph" w:styleId="SignatureBlock">
+    <w:name w:val="SignatureBlock"/>
+    <w:qFormat/>
+    <w:rPr>
+      <w:sz w:val="20"/>
+      <w:rFonts w:ascii="Calibri" w:hAnsi="Calibri" w:cs="Calibri"/>
+    </w:rPr>
+  </w:style>
+  <w:style w:type="paragraph" w:styleId="DisclaimerBody">
+    <w:name w:val="DisclaimerBody"/>
+    <w:qFormat/>
+    <w:rPr>
+      <w:sz w:val="16"/>
+      <w:rFonts w:ascii="Calibri" w:hAnsi="Calibri" w:cs="Calibri"/>
+    </w:rPr>
+  </w:style>
 </w:styles>
 </file>
</xml_diff>